<commit_message>
docs: update Lab 3 API docs and diagrams
</commit_message>
<xml_diff>
--- a/docs/ПСПР. Показ Лаб.3.docx
+++ b/docs/ПСПР. Показ Лаб.3.docx
@@ -200,6 +200,7 @@
           <w:rFonts w:ascii="Times New Roman" w:hAnsi="Times New Roman" w:cs="Times New Roman"/>
           <w:b/>
           <w:bCs/>
+          <w:noProof/>
           <w:sz w:val="28"/>
           <w:szCs w:val="28"/>
         </w:rPr>
@@ -283,13 +284,12 @@
           <w:bCs/>
           <w:sz w:val="28"/>
           <w:szCs w:val="28"/>
-          <w:lang w:val="en-US"/>
         </w:rPr>
         <w:drawing>
-          <wp:inline distT="0" distB="0" distL="0" distR="0" wp14:anchorId="7C3CC4C9" wp14:editId="74C0E393">
-            <wp:extent cx="5940425" cy="2553970"/>
-            <wp:effectExtent l="0" t="0" r="3175" b="0"/>
-            <wp:docPr id="758097402" name="Рисунок 1" descr="Изображение выглядит как снимок экрана, текст&#10;&#10;Содержимое, созданное искусственным интеллектом, может быть неверным."/>
+          <wp:inline distT="0" distB="0" distL="0" distR="0" wp14:anchorId="40CC5CD3" wp14:editId="44AC6ABA">
+            <wp:extent cx="5940425" cy="2229485"/>
+            <wp:effectExtent l="0" t="0" r="3175" b="5715"/>
+            <wp:docPr id="2044658075" name="Рисунок 1" descr="Изображение выглядит как снимок экрана, текст&#10;&#10;Содержимое, созданное искусственным интеллектом, может быть неверным."/>
             <wp:cNvGraphicFramePr>
               <a:graphicFrameLocks xmlns:a="http://schemas.openxmlformats.org/drawingml/2006/main" noChangeAspect="1"/>
             </wp:cNvGraphicFramePr>
@@ -297,7 +297,7 @@
               <a:graphicData uri="http://schemas.openxmlformats.org/drawingml/2006/picture">
                 <pic:pic xmlns:pic="http://schemas.openxmlformats.org/drawingml/2006/picture">
                   <pic:nvPicPr>
-                    <pic:cNvPr id="758097402" name="Рисунок 1" descr="Изображение выглядит как снимок экрана, текст&#10;&#10;Содержимое, созданное искусственным интеллектом, может быть неверным."/>
+                    <pic:cNvPr id="2044658075" name="Рисунок 1" descr="Изображение выглядит как снимок экрана, текст&#10;&#10;Содержимое, созданное искусственным интеллектом, может быть неверным."/>
                     <pic:cNvPicPr/>
                   </pic:nvPicPr>
                   <pic:blipFill>
@@ -309,7 +309,7 @@
                   <pic:spPr>
                     <a:xfrm>
                       <a:off x="0" y="0"/>
-                      <a:ext cx="5940425" cy="2553970"/>
+                      <a:ext cx="5940425" cy="2229485"/>
                     </a:xfrm>
                     <a:prstGeom prst="rect">
                       <a:avLst/>
@@ -356,33 +356,33 @@
           <w:sz w:val="28"/>
           <w:szCs w:val="28"/>
         </w:rPr>
+        <w:t>Создание черновика</w:t>
+      </w:r>
+    </w:p>
+    <w:p>
+      <w:pPr>
+        <w:rPr>
+          <w:rFonts w:ascii="Times New Roman" w:hAnsi="Times New Roman" w:cs="Times New Roman"/>
+          <w:b/>
+          <w:bCs/>
+          <w:sz w:val="28"/>
+          <w:szCs w:val="28"/>
+        </w:rPr>
+      </w:pPr>
+      <w:r>
+        <w:rPr>
+          <w:rFonts w:ascii="Times New Roman" w:hAnsi="Times New Roman" w:cs="Times New Roman"/>
+          <w:b/>
+          <w:bCs/>
+          <w:sz w:val="28"/>
+          <w:szCs w:val="28"/>
+        </w:rPr>
         <w:lastRenderedPageBreak/>
-        <w:t>Создание черновика</w:t>
-      </w:r>
-    </w:p>
-    <w:p>
-      <w:pPr>
-        <w:rPr>
-          <w:rFonts w:ascii="Times New Roman" w:hAnsi="Times New Roman" w:cs="Times New Roman"/>
-          <w:b/>
-          <w:bCs/>
-          <w:sz w:val="28"/>
-          <w:szCs w:val="28"/>
-        </w:rPr>
-      </w:pPr>
-      <w:r>
-        <w:rPr>
-          <w:rFonts w:ascii="Times New Roman" w:hAnsi="Times New Roman" w:cs="Times New Roman"/>
-          <w:b/>
-          <w:bCs/>
-          <w:sz w:val="28"/>
-          <w:szCs w:val="28"/>
-        </w:rPr>
         <w:drawing>
-          <wp:inline distT="0" distB="0" distL="0" distR="0" wp14:anchorId="066C7D5F" wp14:editId="38034EA6">
-            <wp:extent cx="5940425" cy="2578735"/>
-            <wp:effectExtent l="0" t="0" r="3175" b="0"/>
-            <wp:docPr id="1021070723" name="Рисунок 1" descr="Изображение выглядит как снимок экрана, текст&#10;&#10;Содержимое, созданное искусственным интеллектом, может быть неверным."/>
+          <wp:inline distT="0" distB="0" distL="0" distR="0" wp14:anchorId="6D845E9D" wp14:editId="0D274E9A">
+            <wp:extent cx="5940425" cy="2092325"/>
+            <wp:effectExtent l="0" t="0" r="3175" b="3175"/>
+            <wp:docPr id="880297162" name="Рисунок 1" descr="Изображение выглядит как снимок экрана, текст&#10;&#10;Содержимое, созданное искусственным интеллектом, может быть неверным."/>
             <wp:cNvGraphicFramePr>
               <a:graphicFrameLocks xmlns:a="http://schemas.openxmlformats.org/drawingml/2006/main" noChangeAspect="1"/>
             </wp:cNvGraphicFramePr>
@@ -390,7 +390,7 @@
               <a:graphicData uri="http://schemas.openxmlformats.org/drawingml/2006/picture">
                 <pic:pic xmlns:pic="http://schemas.openxmlformats.org/drawingml/2006/picture">
                   <pic:nvPicPr>
-                    <pic:cNvPr id="1021070723" name="Рисунок 1" descr="Изображение выглядит как снимок экрана, текст&#10;&#10;Содержимое, созданное искусственным интеллектом, может быть неверным."/>
+                    <pic:cNvPr id="880297162" name="Рисунок 1" descr="Изображение выглядит как снимок экрана, текст&#10;&#10;Содержимое, созданное искусственным интеллектом, может быть неверным."/>
                     <pic:cNvPicPr/>
                   </pic:nvPicPr>
                   <pic:blipFill>
@@ -402,7 +402,7 @@
                   <pic:spPr>
                     <a:xfrm>
                       <a:off x="0" y="0"/>
-                      <a:ext cx="5940425" cy="2578735"/>
+                      <a:ext cx="5940425" cy="2092325"/>
                     </a:xfrm>
                     <a:prstGeom prst="rect">
                       <a:avLst/>
@@ -430,6 +430,7 @@
           <w:rFonts w:ascii="Times New Roman" w:hAnsi="Times New Roman" w:cs="Times New Roman"/>
           <w:b/>
           <w:bCs/>
+          <w:noProof/>
           <w:sz w:val="28"/>
           <w:szCs w:val="28"/>
         </w:rPr>
@@ -515,10 +516,10 @@
           <w:szCs w:val="28"/>
         </w:rPr>
         <w:drawing>
-          <wp:inline distT="0" distB="0" distL="0" distR="0" wp14:anchorId="3C7A41C8" wp14:editId="14E2DA72">
-            <wp:extent cx="5940425" cy="2545080"/>
+          <wp:inline distT="0" distB="0" distL="0" distR="0" wp14:anchorId="430060EB" wp14:editId="1058FE0A">
+            <wp:extent cx="5940425" cy="2083435"/>
             <wp:effectExtent l="0" t="0" r="3175" b="0"/>
-            <wp:docPr id="656732879" name="Рисунок 1" descr="Изображение выглядит как снимок экрана, текст&#10;&#10;Содержимое, созданное искусственным интеллектом, может быть неверным."/>
+            <wp:docPr id="1100366778" name="Рисунок 1" descr="Изображение выглядит как снимок экрана, текст&#10;&#10;Содержимое, созданное искусственным интеллектом, может быть неверным."/>
             <wp:cNvGraphicFramePr>
               <a:graphicFrameLocks xmlns:a="http://schemas.openxmlformats.org/drawingml/2006/main" noChangeAspect="1"/>
             </wp:cNvGraphicFramePr>
@@ -526,7 +527,7 @@
               <a:graphicData uri="http://schemas.openxmlformats.org/drawingml/2006/picture">
                 <pic:pic xmlns:pic="http://schemas.openxmlformats.org/drawingml/2006/picture">
                   <pic:nvPicPr>
-                    <pic:cNvPr id="656732879" name="Рисунок 1" descr="Изображение выглядит как снимок экрана, текст&#10;&#10;Содержимое, созданное искусственным интеллектом, может быть неверным."/>
+                    <pic:cNvPr id="1100366778" name="Рисунок 1" descr="Изображение выглядит как снимок экрана, текст&#10;&#10;Содержимое, созданное искусственным интеллектом, может быть неверным."/>
                     <pic:cNvPicPr/>
                   </pic:nvPicPr>
                   <pic:blipFill>
@@ -538,7 +539,7 @@
                   <pic:spPr>
                     <a:xfrm>
                       <a:off x="0" y="0"/>
-                      <a:ext cx="5940425" cy="2545080"/>
+                      <a:ext cx="5940425" cy="2083435"/>
                     </a:xfrm>
                     <a:prstGeom prst="rect">
                       <a:avLst/>
@@ -561,48 +562,26 @@
           <w:szCs w:val="28"/>
         </w:rPr>
       </w:pPr>
-    </w:p>
-    <w:p>
-      <w:pPr>
-        <w:rPr>
-          <w:rFonts w:ascii="Times New Roman" w:hAnsi="Times New Roman" w:cs="Times New Roman"/>
-          <w:b/>
-          <w:bCs/>
-          <w:sz w:val="28"/>
-          <w:szCs w:val="28"/>
-        </w:rPr>
-      </w:pPr>
-    </w:p>
-    <w:p>
-      <w:pPr>
-        <w:rPr>
-          <w:rFonts w:ascii="Times New Roman" w:hAnsi="Times New Roman" w:cs="Times New Roman"/>
-          <w:b/>
-          <w:bCs/>
-          <w:sz w:val="28"/>
-          <w:szCs w:val="28"/>
-        </w:rPr>
-      </w:pPr>
-    </w:p>
-    <w:p>
-      <w:pPr>
-        <w:rPr>
-          <w:rFonts w:ascii="Times New Roman" w:hAnsi="Times New Roman" w:cs="Times New Roman"/>
-          <w:b/>
-          <w:bCs/>
-          <w:sz w:val="28"/>
-          <w:szCs w:val="28"/>
-        </w:rPr>
-      </w:pPr>
-    </w:p>
-    <w:p>
-      <w:pPr>
-        <w:rPr>
-          <w:rFonts w:ascii="Times New Roman" w:hAnsi="Times New Roman" w:cs="Times New Roman"/>
-          <w:b/>
-          <w:bCs/>
-          <w:sz w:val="28"/>
-          <w:szCs w:val="28"/>
+      <w:r>
+        <w:rPr>
+          <w:rFonts w:ascii="Times New Roman" w:hAnsi="Times New Roman" w:cs="Times New Roman"/>
+          <w:b/>
+          <w:bCs/>
+          <w:sz w:val="28"/>
+          <w:szCs w:val="28"/>
+        </w:rPr>
+        <w:br w:type="page"/>
+      </w:r>
+    </w:p>
+    <w:p>
+      <w:pPr>
+        <w:rPr>
+          <w:rFonts w:ascii="Times New Roman" w:hAnsi="Times New Roman" w:cs="Times New Roman"/>
+          <w:b/>
+          <w:bCs/>
+          <w:sz w:val="28"/>
+          <w:szCs w:val="28"/>
+          <w:lang w:val="en-US"/>
         </w:rPr>
       </w:pPr>
     </w:p>
@@ -629,7 +608,6 @@
           <w:sz w:val="28"/>
           <w:szCs w:val="28"/>
         </w:rPr>
-        <w:lastRenderedPageBreak/>
         <w:t>Публикация черновика</w:t>
       </w:r>
     </w:p>
@@ -652,10 +630,10 @@
           <w:szCs w:val="28"/>
         </w:rPr>
         <w:drawing>
-          <wp:inline distT="0" distB="0" distL="0" distR="0" wp14:anchorId="58BD1D77" wp14:editId="7FB87FCA">
-            <wp:extent cx="5940425" cy="2842895"/>
-            <wp:effectExtent l="0" t="0" r="3175" b="1905"/>
-            <wp:docPr id="1627960322" name="Рисунок 1" descr="Изображение выглядит как текст, снимок экрана&#10;&#10;Содержимое, созданное искусственным интеллектом, может быть неверным."/>
+          <wp:inline distT="0" distB="0" distL="0" distR="0" wp14:anchorId="45F2F55B" wp14:editId="444F9A3B">
+            <wp:extent cx="5940425" cy="2361565"/>
+            <wp:effectExtent l="0" t="0" r="3175" b="635"/>
+            <wp:docPr id="734434131" name="Рисунок 1" descr="Изображение выглядит как текст, снимок экрана&#10;&#10;Содержимое, созданное искусственным интеллектом, может быть неверным."/>
             <wp:cNvGraphicFramePr>
               <a:graphicFrameLocks xmlns:a="http://schemas.openxmlformats.org/drawingml/2006/main" noChangeAspect="1"/>
             </wp:cNvGraphicFramePr>
@@ -663,7 +641,7 @@
               <a:graphicData uri="http://schemas.openxmlformats.org/drawingml/2006/picture">
                 <pic:pic xmlns:pic="http://schemas.openxmlformats.org/drawingml/2006/picture">
                   <pic:nvPicPr>
-                    <pic:cNvPr id="1627960322" name="Рисунок 1" descr="Изображение выглядит как текст, снимок экрана&#10;&#10;Содержимое, созданное искусственным интеллектом, может быть неверным."/>
+                    <pic:cNvPr id="734434131" name="Рисунок 1" descr="Изображение выглядит как текст, снимок экрана&#10;&#10;Содержимое, созданное искусственным интеллектом, может быть неверным."/>
                     <pic:cNvPicPr/>
                   </pic:nvPicPr>
                   <pic:blipFill>
@@ -675,7 +653,7 @@
                   <pic:spPr>
                     <a:xfrm>
                       <a:off x="0" y="0"/>
-                      <a:ext cx="5940425" cy="2842895"/>
+                      <a:ext cx="5940425" cy="2361565"/>
                     </a:xfrm>
                     <a:prstGeom prst="rect">
                       <a:avLst/>
@@ -701,6 +679,7 @@
       <w:r>
         <w:rPr>
           <w:rFonts w:ascii="Times New Roman" w:hAnsi="Times New Roman" w:cs="Times New Roman"/>
+          <w:noProof/>
           <w:sz w:val="28"/>
           <w:szCs w:val="28"/>
         </w:rPr>
@@ -786,6 +765,7 @@
           <w:bCs/>
           <w:sz w:val="28"/>
           <w:szCs w:val="28"/>
+          <w:lang w:val="en-US"/>
         </w:rPr>
       </w:pPr>
       <w:r>
@@ -797,10 +777,10 @@
           <w:szCs w:val="28"/>
         </w:rPr>
         <w:drawing>
-          <wp:inline distT="0" distB="0" distL="0" distR="0" wp14:anchorId="3B305489" wp14:editId="02FD2DFD">
-            <wp:extent cx="5940425" cy="2736215"/>
+          <wp:inline distT="0" distB="0" distL="0" distR="0" wp14:anchorId="0C943170" wp14:editId="1B51EDF9">
+            <wp:extent cx="5940425" cy="2263140"/>
             <wp:effectExtent l="0" t="0" r="3175" b="0"/>
-            <wp:docPr id="516491266" name="Рисунок 1" descr="Изображение выглядит как снимок экрана, текст&#10;&#10;Содержимое, созданное искусственным интеллектом, может быть неверным."/>
+            <wp:docPr id="1067911392" name="Рисунок 1" descr="Изображение выглядит как снимок экрана, текст&#10;&#10;Содержимое, созданное искусственным интеллектом, может быть неверным."/>
             <wp:cNvGraphicFramePr>
               <a:graphicFrameLocks xmlns:a="http://schemas.openxmlformats.org/drawingml/2006/main" noChangeAspect="1"/>
             </wp:cNvGraphicFramePr>
@@ -808,7 +788,7 @@
               <a:graphicData uri="http://schemas.openxmlformats.org/drawingml/2006/picture">
                 <pic:pic xmlns:pic="http://schemas.openxmlformats.org/drawingml/2006/picture">
                   <pic:nvPicPr>
-                    <pic:cNvPr id="516491266" name="Рисунок 1" descr="Изображение выглядит как снимок экрана, текст&#10;&#10;Содержимое, созданное искусственным интеллектом, может быть неверным."/>
+                    <pic:cNvPr id="1067911392" name="Рисунок 1" descr="Изображение выглядит как снимок экрана, текст&#10;&#10;Содержимое, созданное искусственным интеллектом, может быть неверным."/>
                     <pic:cNvPicPr/>
                   </pic:nvPicPr>
                   <pic:blipFill>
@@ -820,7 +800,7 @@
                   <pic:spPr>
                     <a:xfrm>
                       <a:off x="0" y="0"/>
-                      <a:ext cx="5940425" cy="2736215"/>
+                      <a:ext cx="5940425" cy="2263140"/>
                     </a:xfrm>
                     <a:prstGeom prst="rect">
                       <a:avLst/>
@@ -841,30 +821,20 @@
           <w:bCs/>
           <w:sz w:val="28"/>
           <w:szCs w:val="28"/>
-        </w:rPr>
-      </w:pPr>
-    </w:p>
-    <w:p>
-      <w:pPr>
-        <w:rPr>
-          <w:rFonts w:ascii="Times New Roman" w:hAnsi="Times New Roman" w:cs="Times New Roman"/>
-          <w:b/>
-          <w:bCs/>
-          <w:sz w:val="28"/>
-          <w:szCs w:val="28"/>
-        </w:rPr>
-      </w:pPr>
-    </w:p>
-    <w:p>
-      <w:pPr>
-        <w:rPr>
-          <w:rFonts w:ascii="Times New Roman" w:hAnsi="Times New Roman" w:cs="Times New Roman"/>
-          <w:b/>
-          <w:bCs/>
-          <w:sz w:val="28"/>
-          <w:szCs w:val="28"/>
-        </w:rPr>
-      </w:pPr>
+          <w:lang w:val="en-US"/>
+        </w:rPr>
+      </w:pPr>
+      <w:r>
+        <w:rPr>
+          <w:rFonts w:ascii="Times New Roman" w:hAnsi="Times New Roman" w:cs="Times New Roman"/>
+          <w:b/>
+          <w:bCs/>
+          <w:sz w:val="28"/>
+          <w:szCs w:val="28"/>
+          <w:lang w:val="en-US"/>
+        </w:rPr>
+        <w:br w:type="page"/>
+      </w:r>
     </w:p>
     <w:p>
       <w:pPr>
@@ -914,10 +884,10 @@
           <w:lang w:val="en-US"/>
         </w:rPr>
         <w:drawing>
-          <wp:inline distT="0" distB="0" distL="0" distR="0" wp14:anchorId="25700F87" wp14:editId="1CB8D09E">
-            <wp:extent cx="5940425" cy="2722245"/>
+          <wp:inline distT="0" distB="0" distL="0" distR="0" wp14:anchorId="12A98302" wp14:editId="007D1EF8">
+            <wp:extent cx="5940425" cy="2227580"/>
             <wp:effectExtent l="0" t="0" r="3175" b="0"/>
-            <wp:docPr id="2041029478" name="Рисунок 1" descr="Изображение выглядит как снимок экрана, текст&#10;&#10;Содержимое, созданное искусственным интеллектом, может быть неверным."/>
+            <wp:docPr id="1737330581" name="Рисунок 1" descr="Изображение выглядит как снимок экрана, текст&#10;&#10;Содержимое, созданное искусственным интеллектом, может быть неверным."/>
             <wp:cNvGraphicFramePr>
               <a:graphicFrameLocks xmlns:a="http://schemas.openxmlformats.org/drawingml/2006/main" noChangeAspect="1"/>
             </wp:cNvGraphicFramePr>
@@ -925,7 +895,7 @@
               <a:graphicData uri="http://schemas.openxmlformats.org/drawingml/2006/picture">
                 <pic:pic xmlns:pic="http://schemas.openxmlformats.org/drawingml/2006/picture">
                   <pic:nvPicPr>
-                    <pic:cNvPr id="2041029478" name="Рисунок 1" descr="Изображение выглядит как снимок экрана, текст&#10;&#10;Содержимое, созданное искусственным интеллектом, может быть неверным."/>
+                    <pic:cNvPr id="1737330581" name="Рисунок 1" descr="Изображение выглядит как снимок экрана, текст&#10;&#10;Содержимое, созданное искусственным интеллектом, может быть неверным."/>
                     <pic:cNvPicPr/>
                   </pic:nvPicPr>
                   <pic:blipFill>
@@ -937,7 +907,7 @@
                   <pic:spPr>
                     <a:xfrm>
                       <a:off x="0" y="0"/>
-                      <a:ext cx="5940425" cy="2722245"/>
+                      <a:ext cx="5940425" cy="2227580"/>
                     </a:xfrm>
                     <a:prstGeom prst="rect">
                       <a:avLst/>
@@ -997,10 +967,10 @@
           <w:lang w:val="en-US"/>
         </w:rPr>
         <w:drawing>
-          <wp:inline distT="0" distB="0" distL="0" distR="0" wp14:anchorId="754258E0" wp14:editId="639612B6">
-            <wp:extent cx="5940425" cy="1145540"/>
+          <wp:inline distT="0" distB="0" distL="0" distR="0" wp14:anchorId="65DEAD0D" wp14:editId="20335A02">
+            <wp:extent cx="5940425" cy="818515"/>
             <wp:effectExtent l="0" t="0" r="3175" b="0"/>
-            <wp:docPr id="1008168966" name="Рисунок 1" descr="Изображение выглядит как снимок экрана, текст&#10;&#10;Содержимое, созданное искусственным интеллектом, может быть неверным."/>
+            <wp:docPr id="1031550102" name="Рисунок 1" descr="Изображение выглядит как снимок экрана, текст&#10;&#10;Содержимое, созданное искусственным интеллектом, может быть неверным."/>
             <wp:cNvGraphicFramePr>
               <a:graphicFrameLocks xmlns:a="http://schemas.openxmlformats.org/drawingml/2006/main" noChangeAspect="1"/>
             </wp:cNvGraphicFramePr>
@@ -1008,7 +978,7 @@
               <a:graphicData uri="http://schemas.openxmlformats.org/drawingml/2006/picture">
                 <pic:pic xmlns:pic="http://schemas.openxmlformats.org/drawingml/2006/picture">
                   <pic:nvPicPr>
-                    <pic:cNvPr id="1008168966" name="Рисунок 1" descr="Изображение выглядит как снимок экрана, текст&#10;&#10;Содержимое, созданное искусственным интеллектом, может быть неверным."/>
+                    <pic:cNvPr id="1031550102" name="Рисунок 1" descr="Изображение выглядит как снимок экрана, текст&#10;&#10;Содержимое, созданное искусственным интеллектом, может быть неверным."/>
                     <pic:cNvPicPr/>
                   </pic:nvPicPr>
                   <pic:blipFill>
@@ -1020,7 +990,7 @@
                   <pic:spPr>
                     <a:xfrm>
                       <a:off x="0" y="0"/>
-                      <a:ext cx="5940425" cy="1145540"/>
+                      <a:ext cx="5940425" cy="818515"/>
                     </a:xfrm>
                     <a:prstGeom prst="rect">
                       <a:avLst/>
@@ -1047,42 +1017,6 @@
     </w:p>
     <w:p>
       <w:pPr>
-        <w:rPr>
-          <w:rFonts w:ascii="Times New Roman" w:hAnsi="Times New Roman" w:cs="Times New Roman"/>
-          <w:b/>
-          <w:bCs/>
-          <w:sz w:val="28"/>
-          <w:szCs w:val="28"/>
-          <w:lang w:val="en-US"/>
-        </w:rPr>
-      </w:pPr>
-    </w:p>
-    <w:p>
-      <w:pPr>
-        <w:rPr>
-          <w:rFonts w:ascii="Times New Roman" w:hAnsi="Times New Roman" w:cs="Times New Roman"/>
-          <w:b/>
-          <w:bCs/>
-          <w:sz w:val="28"/>
-          <w:szCs w:val="28"/>
-          <w:lang w:val="en-US"/>
-        </w:rPr>
-      </w:pPr>
-    </w:p>
-    <w:p>
-      <w:pPr>
-        <w:rPr>
-          <w:rFonts w:ascii="Times New Roman" w:hAnsi="Times New Roman" w:cs="Times New Roman"/>
-          <w:b/>
-          <w:bCs/>
-          <w:sz w:val="28"/>
-          <w:szCs w:val="28"/>
-          <w:lang w:val="en-US"/>
-        </w:rPr>
-      </w:pPr>
-    </w:p>
-    <w:p>
-      <w:pPr>
         <w:pStyle w:val="a7"/>
         <w:numPr>
           <w:ilvl w:val="0"/>
@@ -1124,13 +1058,12 @@
           <w:bCs/>
           <w:sz w:val="28"/>
           <w:szCs w:val="28"/>
-          <w:lang w:val="en-US"/>
         </w:rPr>
         <w:drawing>
-          <wp:inline distT="0" distB="0" distL="0" distR="0" wp14:anchorId="3697AA03" wp14:editId="2CC5FF93">
-            <wp:extent cx="5940425" cy="1181100"/>
-            <wp:effectExtent l="0" t="0" r="3175" b="0"/>
-            <wp:docPr id="174791031" name="Рисунок 1" descr="Изображение выглядит как снимок экрана, текст&#10;&#10;Содержимое, созданное искусственным интеллектом, может быть неверным."/>
+          <wp:inline distT="0" distB="0" distL="0" distR="0" wp14:anchorId="61A6BBC4" wp14:editId="651E14CA">
+            <wp:extent cx="5940425" cy="988060"/>
+            <wp:effectExtent l="0" t="0" r="3175" b="2540"/>
+            <wp:docPr id="812651961" name="Рисунок 1" descr="Изображение выглядит как снимок экрана, текст&#10;&#10;Содержимое, созданное искусственным интеллектом, может быть неверным."/>
             <wp:cNvGraphicFramePr>
               <a:graphicFrameLocks xmlns:a="http://schemas.openxmlformats.org/drawingml/2006/main" noChangeAspect="1"/>
             </wp:cNvGraphicFramePr>
@@ -1138,7 +1071,7 @@
               <a:graphicData uri="http://schemas.openxmlformats.org/drawingml/2006/picture">
                 <pic:pic xmlns:pic="http://schemas.openxmlformats.org/drawingml/2006/picture">
                   <pic:nvPicPr>
-                    <pic:cNvPr id="174791031" name="Рисунок 1" descr="Изображение выглядит как снимок экрана, текст&#10;&#10;Содержимое, созданное искусственным интеллектом, может быть неверным."/>
+                    <pic:cNvPr id="812651961" name="Рисунок 1" descr="Изображение выглядит как снимок экрана, текст&#10;&#10;Содержимое, созданное искусственным интеллектом, может быть неверным."/>
                     <pic:cNvPicPr/>
                   </pic:nvPicPr>
                   <pic:blipFill>
@@ -1150,7 +1083,7 @@
                   <pic:spPr>
                     <a:xfrm>
                       <a:off x="0" y="0"/>
-                      <a:ext cx="5940425" cy="1181100"/>
+                      <a:ext cx="5940425" cy="988060"/>
                     </a:xfrm>
                     <a:prstGeom prst="rect">
                       <a:avLst/>
@@ -1176,6 +1109,7 @@
       <w:r>
         <w:rPr>
           <w:rFonts w:ascii="Times New Roman" w:hAnsi="Times New Roman" w:cs="Times New Roman"/>
+          <w:noProof/>
           <w:sz w:val="28"/>
           <w:szCs w:val="28"/>
         </w:rPr>
@@ -1239,7 +1173,6 @@
           <w:sz w:val="28"/>
           <w:szCs w:val="28"/>
         </w:rPr>
-        <w:lastRenderedPageBreak/>
         <w:t>Регистрация</w:t>
       </w:r>
     </w:p>
@@ -1251,22 +1184,22 @@
           <w:bCs/>
           <w:sz w:val="28"/>
           <w:szCs w:val="28"/>
+        </w:rPr>
+      </w:pPr>
+      <w:r>
+        <w:rPr>
+          <w:rFonts w:ascii="Times New Roman" w:hAnsi="Times New Roman" w:cs="Times New Roman"/>
+          <w:b/>
+          <w:bCs/>
+          <w:sz w:val="28"/>
+          <w:szCs w:val="28"/>
           <w:lang w:val="en-US"/>
         </w:rPr>
-      </w:pPr>
-      <w:r>
-        <w:rPr>
-          <w:rFonts w:ascii="Times New Roman" w:hAnsi="Times New Roman" w:cs="Times New Roman"/>
-          <w:b/>
-          <w:bCs/>
-          <w:sz w:val="28"/>
-          <w:szCs w:val="28"/>
-        </w:rPr>
         <w:drawing>
-          <wp:inline distT="0" distB="0" distL="0" distR="0" wp14:anchorId="110EAD4A" wp14:editId="062DB523">
-            <wp:extent cx="5940425" cy="1136015"/>
-            <wp:effectExtent l="0" t="0" r="3175" b="0"/>
-            <wp:docPr id="1963946918" name="Рисунок 1" descr="Изображение выглядит как снимок экрана, текст&#10;&#10;Содержимое, созданное искусственным интеллектом, может быть неверным."/>
+          <wp:inline distT="0" distB="0" distL="0" distR="0" wp14:anchorId="465728FD" wp14:editId="53E11EC4">
+            <wp:extent cx="5940425" cy="824865"/>
+            <wp:effectExtent l="0" t="0" r="3175" b="635"/>
+            <wp:docPr id="423143683" name="Рисунок 1" descr="Изображение выглядит как снимок экрана, текст&#10;&#10;Содержимое, созданное искусственным интеллектом, может быть неверным."/>
             <wp:cNvGraphicFramePr>
               <a:graphicFrameLocks xmlns:a="http://schemas.openxmlformats.org/drawingml/2006/main" noChangeAspect="1"/>
             </wp:cNvGraphicFramePr>
@@ -1274,7 +1207,7 @@
               <a:graphicData uri="http://schemas.openxmlformats.org/drawingml/2006/picture">
                 <pic:pic xmlns:pic="http://schemas.openxmlformats.org/drawingml/2006/picture">
                   <pic:nvPicPr>
-                    <pic:cNvPr id="1963946918" name="Рисунок 1" descr="Изображение выглядит как снимок экрана, текст&#10;&#10;Содержимое, созданное искусственным интеллектом, может быть неверным."/>
+                    <pic:cNvPr id="423143683" name="Рисунок 1" descr="Изображение выглядит как снимок экрана, текст&#10;&#10;Содержимое, созданное искусственным интеллектом, может быть неверным."/>
                     <pic:cNvPicPr/>
                   </pic:nvPicPr>
                   <pic:blipFill>
@@ -1286,7 +1219,7 @@
                   <pic:spPr>
                     <a:xfrm>
                       <a:off x="0" y="0"/>
-                      <a:ext cx="5940425" cy="1136015"/>
+                      <a:ext cx="5940425" cy="824865"/>
                     </a:xfrm>
                     <a:prstGeom prst="rect">
                       <a:avLst/>
@@ -1351,10 +1284,12 @@
           <w:rFonts w:ascii="Times New Roman" w:hAnsi="Times New Roman" w:cs="Times New Roman"/>
           <w:b/>
           <w:bCs/>
+          <w:noProof/>
           <w:sz w:val="28"/>
           <w:szCs w:val="28"/>
           <w:lang w:val="en-US"/>
         </w:rPr>
+        <w:lastRenderedPageBreak/>
         <w:drawing>
           <wp:inline distT="0" distB="0" distL="0" distR="0" wp14:anchorId="3FE3F973" wp14:editId="54EA7A51">
             <wp:extent cx="5940425" cy="2825115"/>
@@ -1407,6 +1342,7 @@
           <w:rFonts w:ascii="Times New Roman" w:hAnsi="Times New Roman" w:cs="Times New Roman"/>
           <w:b/>
           <w:bCs/>
+          <w:noProof/>
           <w:sz w:val="28"/>
           <w:szCs w:val="28"/>
           <w:lang w:val="en-US"/>
@@ -1500,6 +1436,7 @@
           <w:rFonts w:ascii="Times New Roman" w:hAnsi="Times New Roman" w:cs="Times New Roman"/>
           <w:b/>
           <w:bCs/>
+          <w:noProof/>
           <w:sz w:val="28"/>
           <w:szCs w:val="28"/>
         </w:rPr>

</xml_diff>